<commit_message>
Returned the like mark instead of the next principality id in the feed after lab 3 review
</commit_message>
<xml_diff>
--- a/docs/lab2-corrections.docx
+++ b/docs/lab2-corrections.docx
@@ -93,7 +93,23 @@
           <w:bCs/>
           <w:lang w:val="ru-RU"/>
         </w:rPr>
-        <w:t>Правки 2, 7</w:t>
+        <w:t>Правк</w:t>
+      </w:r>
+      <w:r>
+        <w:rPr>
+          <w:b/>
+          <w:bCs/>
+          <w:lang w:val="ru-RU"/>
+        </w:rPr>
+        <w:t xml:space="preserve">а </w:t>
+      </w:r>
+      <w:r>
+        <w:rPr>
+          <w:b/>
+          <w:bCs/>
+          <w:lang w:val="ru-RU"/>
+        </w:rPr>
+        <w:t>2</w:t>
       </w:r>
     </w:p>
     <w:p>
@@ -269,25 +285,24 @@
         <w:spacing w:after="120" w:line="300" w:lineRule="auto"/>
         <w:ind w:firstLine="709"/>
         <w:jc w:val="both"/>
-      </w:pPr>
-      <w:r>
-        <w:t>«</w:t>
-      </w:r>
-      <w:proofErr w:type="spellStart"/>
-      <w:r>
-        <w:t>по</w:t>
-      </w:r>
-      <w:proofErr w:type="spellEnd"/>
-      <w:r>
-        <w:t xml:space="preserve"> </w:t>
-      </w:r>
-      <w:proofErr w:type="spellStart"/>
-      <w:r>
-        <w:t>умолчанию</w:t>
-      </w:r>
-      <w:proofErr w:type="spellEnd"/>
-      <w:r>
-        <w:t xml:space="preserve"> НЕ Minio»</w:t>
+        <w:rPr>
+          <w:lang w:val="ru-RU"/>
+        </w:rPr>
+      </w:pPr>
+      <w:r>
+        <w:rPr>
+          <w:lang w:val="ru-RU"/>
+        </w:rPr>
+        <w:t xml:space="preserve">«по умолчанию НЕ </w:t>
+      </w:r>
+      <w:r>
+        <w:t>Minio</w:t>
+      </w:r>
+      <w:r>
+        <w:rPr>
+          <w:lang w:val="ru-RU"/>
+        </w:rPr>
+        <w:t>»</w:t>
       </w:r>
     </w:p>
     <w:p>
@@ -577,7 +592,23 @@
           <w:lang w:val="ru-RU"/>
         </w:rPr>
         <w:lastRenderedPageBreak/>
-        <w:t>Правки 5, 6, 7</w:t>
+        <w:t>Правк</w:t>
+      </w:r>
+      <w:r>
+        <w:rPr>
+          <w:b/>
+          <w:bCs/>
+          <w:lang w:val="ru-RU"/>
+        </w:rPr>
+        <w:t>а</w:t>
+      </w:r>
+      <w:r>
+        <w:rPr>
+          <w:b/>
+          <w:bCs/>
+          <w:lang w:val="ru-RU"/>
+        </w:rPr>
+        <w:t xml:space="preserve"> 5</w:t>
       </w:r>
     </w:p>
     <w:p>

</xml_diff>